<commit_message>
Ajusta formatacao do Curriculo: titulos de projetos em negrito 10pt
</commit_message>
<xml_diff>
--- a/curriculo/Curriculo_Luiz_Augusto_2026.docx
+++ b/curriculo/Curriculo_Luiz_Augusto_2026.docx
@@ -784,56 +784,76 @@
     <w:p>
       <w:pPr/>
       <w:r>
-        <w:rPr/>
+        <w:rPr>
+          <w:b/>
+          <w:sz w:val="20"/>
+        </w:rPr>
         <w:t xml:space="preserve">Site de Atleta de Futebol | Python, Django, Bootstrap | https://luizatleta.pythonanywhere.com/</w:t>
       </w:r>
     </w:p>
     <w:p>
       <w:pPr/>
       <w:r>
-        <w:rPr/>
+        <w:rPr>
+          <w:sz w:val="20"/>
+        </w:rPr>
         <w:t xml:space="preserve">Site profissional para atleta com perfil, atributos técnicos, galeria de fotos, histórico de clubes e painel administrativo.</w:t>
       </w:r>
     </w:p>
     <w:p>
       <w:pPr/>
       <w:r>
-        <w:rPr/>
+        <w:rPr>
+          <w:b/>
+          <w:sz w:val="20"/>
+        </w:rPr>
         <w:t xml:space="preserve">Ateliê da Dri — Loja Online | HTML, CSS, JavaScript | github.com/luizaugusto2006/Atelie-da-Dri</w:t>
       </w:r>
     </w:p>
     <w:p>
       <w:pPr/>
       <w:r>
-        <w:rPr/>
+        <w:rPr>
+          <w:sz w:val="20"/>
+        </w:rPr>
         <w:t xml:space="preserve">E-commerce de artesanato com catálogo de produtos, imagens e estrutura pronta para vendas.</w:t>
       </w:r>
     </w:p>
     <w:p>
       <w:pPr/>
       <w:r>
-        <w:rPr/>
+        <w:rPr>
+          <w:b/>
+          <w:sz w:val="20"/>
+        </w:rPr>
         <w:t xml:space="preserve">Site Advocacia Ricardo Lima | HTML, CSS | github.com/luizaugusto2006/Site-Advocacia</w:t>
       </w:r>
     </w:p>
     <w:p>
       <w:pPr/>
       <w:r>
-        <w:rPr/>
+        <w:rPr>
+          <w:sz w:val="20"/>
+        </w:rPr>
         <w:t xml:space="preserve">Site institucional para escritório de advocacia com áreas de atuação e equipe.</w:t>
       </w:r>
     </w:p>
     <w:p>
       <w:pPr/>
       <w:r>
-        <w:rPr/>
+        <w:rPr>
+          <w:b/>
+          <w:sz w:val="20"/>
+        </w:rPr>
         <w:t xml:space="preserve">Otimizador de Sistema (PowerShell) | PowerShell, Automação | github.com/luizaugusto2006/Otimizador</w:t>
       </w:r>
     </w:p>
     <w:p>
       <w:pPr/>
       <w:r>
-        <w:rPr/>
+        <w:rPr>
+          <w:sz w:val="20"/>
+        </w:rPr>
         <w:t xml:space="preserve">Script de manutenção e otimização do Windows: limpeza de arquivos temporários, cache e ajustes de desempenho.</w:t>
       </w:r>
     </w:p>

</xml_diff>